<commit_message>
fix: Remove second to last page (END OF PROPOSAL) from both commercial and technical proposal templates
</commit_message>
<xml_diff>
--- a/COMMERCIAL PROPOSAL_V2.docx
+++ b/COMMERCIAL PROPOSAL_V2.docx
@@ -12725,318 +12725,6 @@
           <w:rFonts w:ascii="Aptos" w:hAnsi="Aptos"/>
         </w:rPr>
         <w:t xml:space="preserve">Post acceptance of the Proposal a 3-year Contract Agreement shall be signed for detailed terms and conditions. </w:t>
-      </w:r>
-    </w:p>
-    <w:p>
-      <w:pPr>
-        <w:rPr>
-          <w:rFonts w:ascii="Aptos" w:hAnsi="Aptos"/>
-        </w:rPr>
-      </w:pPr>
-    </w:p>
-    <w:p>
-      <w:pPr>
-        <w:spacing w:before="100" w:beforeAutospacing="1" w:after="100" w:afterAutospacing="1"/>
-        <w:jc w:val="both"/>
-        <w:rPr>
-          <w:rFonts w:asciiTheme="minorHAnsi" w:hAnsiTheme="minorHAnsi"/>
-        </w:rPr>
-      </w:pPr>
-    </w:p>
-    <w:p>
-      <w:pPr>
-        <w:spacing w:before="100" w:beforeAutospacing="1" w:after="100" w:afterAutospacing="1"/>
-        <w:jc w:val="both"/>
-        <w:rPr>
-          <w:rFonts w:asciiTheme="minorHAnsi" w:hAnsiTheme="minorHAnsi"/>
-        </w:rPr>
-      </w:pPr>
-    </w:p>
-    <w:p>
-      <w:pPr>
-        <w:spacing w:before="100" w:beforeAutospacing="1" w:after="100" w:afterAutospacing="1"/>
-        <w:jc w:val="both"/>
-        <w:rPr>
-          <w:rFonts w:asciiTheme="minorHAnsi" w:hAnsiTheme="minorHAnsi"/>
-        </w:rPr>
-      </w:pPr>
-    </w:p>
-    <w:p>
-      <w:pPr>
-        <w:spacing w:before="100" w:beforeAutospacing="1" w:after="100" w:afterAutospacing="1"/>
-        <w:jc w:val="both"/>
-        <w:rPr>
-          <w:rFonts w:asciiTheme="minorHAnsi" w:hAnsiTheme="minorHAnsi"/>
-        </w:rPr>
-      </w:pPr>
-    </w:p>
-    <w:p>
-      <w:pPr>
-        <w:spacing w:before="100" w:beforeAutospacing="1" w:after="100" w:afterAutospacing="1"/>
-        <w:jc w:val="both"/>
-        <w:rPr>
-          <w:rFonts w:asciiTheme="minorHAnsi" w:hAnsiTheme="minorHAnsi"/>
-        </w:rPr>
-      </w:pPr>
-    </w:p>
-    <w:p>
-      <w:pPr>
-        <w:spacing w:before="100" w:beforeAutospacing="1" w:after="100" w:afterAutospacing="1"/>
-        <w:jc w:val="both"/>
-        <w:rPr>
-          <w:rFonts w:asciiTheme="minorHAnsi" w:hAnsiTheme="minorHAnsi"/>
-        </w:rPr>
-      </w:pPr>
-    </w:p>
-    <w:p>
-      <w:pPr>
-        <w:spacing w:before="100" w:beforeAutospacing="1" w:after="100" w:afterAutospacing="1"/>
-        <w:jc w:val="both"/>
-        <w:rPr>
-          <w:rFonts w:asciiTheme="minorHAnsi" w:hAnsiTheme="minorHAnsi"/>
-        </w:rPr>
-      </w:pPr>
-    </w:p>
-    <w:p>
-      <w:pPr>
-        <w:spacing w:before="100" w:beforeAutospacing="1" w:after="100" w:afterAutospacing="1"/>
-        <w:jc w:val="both"/>
-        <w:rPr>
-          <w:rFonts w:asciiTheme="minorHAnsi" w:hAnsiTheme="minorHAnsi"/>
-        </w:rPr>
-      </w:pPr>
-    </w:p>
-    <w:p>
-      <w:pPr>
-        <w:spacing w:before="100" w:beforeAutospacing="1" w:after="100" w:afterAutospacing="1"/>
-        <w:jc w:val="both"/>
-        <w:rPr>
-          <w:rFonts w:asciiTheme="minorHAnsi" w:hAnsiTheme="minorHAnsi"/>
-        </w:rPr>
-      </w:pPr>
-    </w:p>
-    <w:p>
-      <w:pPr>
-        <w:spacing w:before="100" w:beforeAutospacing="1" w:after="100" w:afterAutospacing="1"/>
-        <w:jc w:val="both"/>
-        <w:rPr>
-          <w:rFonts w:asciiTheme="minorHAnsi" w:hAnsiTheme="minorHAnsi"/>
-        </w:rPr>
-      </w:pPr>
-    </w:p>
-    <w:p>
-      <w:pPr>
-        <w:spacing w:before="100" w:beforeAutospacing="1" w:after="100" w:afterAutospacing="1"/>
-        <w:jc w:val="both"/>
-        <w:rPr>
-          <w:rFonts w:asciiTheme="minorHAnsi" w:hAnsiTheme="minorHAnsi"/>
-        </w:rPr>
-      </w:pPr>
-    </w:p>
-    <w:p>
-      <w:pPr>
-        <w:spacing w:before="100" w:beforeAutospacing="1" w:after="100" w:afterAutospacing="1"/>
-        <w:jc w:val="both"/>
-        <w:rPr>
-          <w:rFonts w:asciiTheme="minorHAnsi" w:hAnsiTheme="minorHAnsi"/>
-        </w:rPr>
-      </w:pPr>
-    </w:p>
-    <w:p>
-      <w:pPr>
-        <w:spacing w:before="100" w:beforeAutospacing="1" w:after="100" w:afterAutospacing="1"/>
-        <w:jc w:val="both"/>
-        <w:rPr>
-          <w:rFonts w:asciiTheme="minorHAnsi" w:hAnsiTheme="minorHAnsi"/>
-        </w:rPr>
-      </w:pPr>
-    </w:p>
-    <w:p>
-      <w:pPr>
-        <w:spacing w:before="100" w:beforeAutospacing="1" w:after="100" w:afterAutospacing="1"/>
-        <w:jc w:val="both"/>
-        <w:rPr>
-          <w:rFonts w:asciiTheme="minorHAnsi" w:hAnsiTheme="minorHAnsi"/>
-        </w:rPr>
-      </w:pPr>
-    </w:p>
-    <w:p>
-      <w:pPr>
-        <w:spacing w:before="100" w:beforeAutospacing="1" w:after="100" w:afterAutospacing="1"/>
-        <w:jc w:val="both"/>
-        <w:rPr>
-          <w:rFonts w:asciiTheme="minorHAnsi" w:hAnsiTheme="minorHAnsi"/>
-        </w:rPr>
-      </w:pPr>
-    </w:p>
-    <w:p>
-      <w:pPr>
-        <w:spacing w:before="100" w:beforeAutospacing="1" w:after="100" w:afterAutospacing="1"/>
-        <w:jc w:val="both"/>
-        <w:rPr>
-          <w:rFonts w:asciiTheme="minorHAnsi" w:hAnsiTheme="minorHAnsi"/>
-        </w:rPr>
-      </w:pPr>
-    </w:p>
-    <w:p>
-      <w:pPr>
-        <w:spacing w:before="100" w:beforeAutospacing="1" w:after="100" w:afterAutospacing="1"/>
-        <w:jc w:val="both"/>
-        <w:rPr>
-          <w:rFonts w:asciiTheme="minorHAnsi" w:hAnsiTheme="minorHAnsi"/>
-        </w:rPr>
-      </w:pPr>
-    </w:p>
-    <w:p>
-      <w:pPr>
-        <w:spacing w:before="100" w:beforeAutospacing="1" w:after="100" w:afterAutospacing="1"/>
-        <w:jc w:val="both"/>
-        <w:rPr>
-          <w:rFonts w:asciiTheme="minorHAnsi" w:hAnsiTheme="minorHAnsi"/>
-        </w:rPr>
-      </w:pPr>
-    </w:p>
-    <w:p>
-      <w:pPr>
-        <w:spacing w:before="100" w:beforeAutospacing="1" w:after="100" w:afterAutospacing="1"/>
-        <w:jc w:val="center"/>
-        <w:rPr>
-          <w:rFonts w:asciiTheme="minorHAnsi" w:hAnsiTheme="minorHAnsi"/>
-          <w:b/>
-          <w:bCs/>
-          <w:sz w:val="21"/>
-          <w:szCs w:val="21"/>
-        </w:rPr>
-      </w:pPr>
-      <w:r>
-        <w:rPr>
-          <w:rFonts w:asciiTheme="minorHAnsi" w:hAnsiTheme="minorHAnsi"/>
-          <w:b/>
-          <w:bCs/>
-          <w:sz w:val="21"/>
-          <w:szCs w:val="21"/>
-        </w:rPr>
-        <w:t>END OF PROPOSAL</w:t>
-      </w:r>
-    </w:p>
-    <w:p>
-      <w:pPr>
-        <w:spacing w:before="100" w:beforeAutospacing="1" w:after="100" w:afterAutospacing="1"/>
-        <w:jc w:val="both"/>
-        <w:rPr>
-          <w:rFonts w:asciiTheme="minorHAnsi" w:hAnsiTheme="minorHAnsi"/>
-          <w:b/>
-          <w:bCs/>
-          <w:sz w:val="21"/>
-          <w:szCs w:val="21"/>
-        </w:rPr>
-      </w:pPr>
-    </w:p>
-    <w:p>
-      <w:pPr>
-        <w:spacing w:before="100" w:beforeAutospacing="1" w:after="100" w:afterAutospacing="1"/>
-        <w:jc w:val="both"/>
-        <w:rPr>
-          <w:rFonts w:asciiTheme="minorHAnsi" w:hAnsiTheme="minorHAnsi"/>
-        </w:rPr>
-      </w:pPr>
-    </w:p>
-    <w:p>
-      <w:pPr>
-        <w:spacing w:before="100" w:beforeAutospacing="1" w:after="100" w:afterAutospacing="1"/>
-        <w:jc w:val="both"/>
-        <w:rPr>
-          <w:rFonts w:asciiTheme="minorHAnsi" w:hAnsiTheme="minorHAnsi"/>
-        </w:rPr>
-      </w:pPr>
-    </w:p>
-    <w:p/>
-    <w:p/>
-    <w:p/>
-    <w:p/>
-    <w:p/>
-    <w:p/>
-    <w:p/>
-    <w:p/>
-    <w:p/>
-    <w:p/>
-    <w:p/>
-    <w:p/>
-    <w:p/>
-    <w:p/>
-    <w:p/>
-    <w:p/>
-    <w:p/>
-    <w:p>
-      <w:r>
-        <w:rPr>
-          <w:rFonts w:asciiTheme="minorHAnsi" w:hAnsiTheme="minorHAnsi"/>
-          <w:noProof/>
-        </w:rPr>
-        <w:lastRenderedPageBreak/>
-        <w:drawing>
-          <wp:anchor distT="0" distB="0" distL="114300" distR="114300" simplePos="0" relativeHeight="251665408" behindDoc="1" locked="0" layoutInCell="1" allowOverlap="1" wp14:anchorId="6DC9D02D" wp14:editId="0282E8B5">
-            <wp:simplePos x="0" y="0"/>
-            <wp:positionH relativeFrom="page">
-              <wp:align>left</wp:align>
-            </wp:positionH>
-            <wp:positionV relativeFrom="paragraph">
-              <wp:posOffset>0</wp:posOffset>
-            </wp:positionV>
-            <wp:extent cx="7596505" cy="9930765"/>
-            <wp:effectExtent l="0" t="0" r="4445" b="0"/>
-            <wp:wrapTight wrapText="bothSides">
-              <wp:wrapPolygon edited="0">
-                <wp:start x="0" y="0"/>
-                <wp:lineTo x="0" y="21546"/>
-                <wp:lineTo x="21558" y="21546"/>
-                <wp:lineTo x="21558" y="0"/>
-                <wp:lineTo x="0" y="0"/>
-              </wp:wrapPolygon>
-            </wp:wrapTight>
-            <wp:docPr id="1443243417" name="Picture 1"/>
-            <wp:cNvGraphicFramePr>
-              <a:graphicFrameLocks xmlns:a="http://schemas.openxmlformats.org/drawingml/2006/main" noChangeAspect="1"/>
-            </wp:cNvGraphicFramePr>
-            <a:graphic xmlns:a="http://schemas.openxmlformats.org/drawingml/2006/main">
-              <a:graphicData uri="http://schemas.openxmlformats.org/drawingml/2006/picture">
-                <pic:pic xmlns:pic="http://schemas.openxmlformats.org/drawingml/2006/picture">
-                  <pic:nvPicPr>
-                    <pic:cNvPr id="1443243417" name=""/>
-                    <pic:cNvPicPr/>
-                  </pic:nvPicPr>
-                  <pic:blipFill>
-                    <a:blip r:embed="rId9">
-                      <a:extLst>
-                        <a:ext uri="{28A0092B-C50C-407E-A947-70E740481C1C}">
-                          <a14:useLocalDpi xmlns:a14="http://schemas.microsoft.com/office/drawing/2010/main" val="0"/>
-                        </a:ext>
-                      </a:extLst>
-                    </a:blip>
-                    <a:stretch>
-                      <a:fillRect/>
-                    </a:stretch>
-                  </pic:blipFill>
-                  <pic:spPr>
-                    <a:xfrm>
-                      <a:off x="0" y="0"/>
-                      <a:ext cx="7596505" cy="9930765"/>
-                    </a:xfrm>
-                    <a:prstGeom prst="rect">
-                      <a:avLst/>
-                    </a:prstGeom>
-                  </pic:spPr>
-                </pic:pic>
-              </a:graphicData>
-            </a:graphic>
-            <wp14:sizeRelH relativeFrom="page">
-              <wp14:pctWidth>0</wp14:pctWidth>
-            </wp14:sizeRelH>
-            <wp14:sizeRelV relativeFrom="page">
-              <wp14:pctHeight>0</wp14:pctHeight>
-            </wp14:sizeRelV>
-          </wp:anchor>
-        </w:drawing>
       </w:r>
     </w:p>
     <w:sectPr>

</xml_diff>